<commit_message>
update short workshop files to 3.9.0
</commit_message>
<xml_diff>
--- a/OS_exercises/openstudio-short/tutorial_exercise.docx
+++ b/OS_exercises/openstudio-short/tutorial_exercise.docx
@@ -122,15 +122,7 @@
         <w:t>it with</w:t>
       </w:r>
       <w:r>
-        <w:t xml:space="preserve"> </w:t>
-      </w:r>
-      <w:proofErr w:type="spellStart"/>
-      <w:r>
-        <w:t>OpenStudio’s</w:t>
-      </w:r>
-      <w:proofErr w:type="spellEnd"/>
-      <w:r>
-        <w:t xml:space="preserve"> auto-calculated value</w:t>
+        <w:t xml:space="preserve"> OpenStudio’s auto-calculated value</w:t>
       </w:r>
       <w:r>
         <w:t xml:space="preserve"> later on</w:t>
@@ -284,7 +276,10 @@
         <w:pStyle w:val="Heading2"/>
       </w:pPr>
       <w:r>
-        <w:t>Envelope exercise</w:t>
+        <w:t xml:space="preserve">Envelope </w:t>
+      </w:r>
+      <w:r>
+        <w:t>steps</w:t>
       </w:r>
     </w:p>
     <w:p>
@@ -296,23 +291,7 @@
         </w:numPr>
       </w:pPr>
       <w:r>
-        <w:t>Define the opaque material layers (i.e., everything except the air gap) for the “</w:t>
-      </w:r>
-      <w:proofErr w:type="spellStart"/>
-      <w:r>
-        <w:t>blu_wall</w:t>
-      </w:r>
-      <w:proofErr w:type="spellEnd"/>
-      <w:r>
-        <w:t>”, “</w:t>
-      </w:r>
-      <w:proofErr w:type="spellStart"/>
-      <w:r>
-        <w:t>attic_flr</w:t>
-      </w:r>
-      <w:proofErr w:type="spellEnd"/>
-      <w:r>
-        <w:t>”, and “roof” construction found in “</w:t>
+        <w:t>Define the opaque material layers (i.e., everything except the air gap) for the “blu_wall”, “attic_flr”, and “roof” construction found in “</w:t>
       </w:r>
       <w:r>
         <w:t>building</w:t>
@@ -1178,15 +1157,7 @@
         <w:t xml:space="preserve">surfaces’ environmental conditions are properly set. </w:t>
       </w:r>
       <w:r>
-        <w:t>For example, “</w:t>
-      </w:r>
-      <w:proofErr w:type="spellStart"/>
-      <w:r>
-        <w:t>blu</w:t>
-      </w:r>
-      <w:proofErr w:type="spellEnd"/>
-      <w:r>
-        <w:t xml:space="preserve"> 3”surface is an exterior wall, that’s exposed to the outside environment. </w:t>
+        <w:t xml:space="preserve">For example, “blu 3”surface is an exterior wall, that’s exposed to the outside environment. </w:t>
       </w:r>
     </w:p>
     <w:p>
@@ -1709,15 +1680,7 @@
         <w:t>Outdoors</w:t>
       </w:r>
       <w:r>
-        <w:t xml:space="preserve"> – use “</w:t>
-      </w:r>
-      <w:proofErr w:type="spellStart"/>
-      <w:r>
-        <w:t>blu_wall</w:t>
-      </w:r>
-      <w:proofErr w:type="spellEnd"/>
-      <w:r>
-        <w:t>”</w:t>
+        <w:t xml:space="preserve"> – use “blu_wall”</w:t>
       </w:r>
     </w:p>
     <w:p>
@@ -1749,15 +1712,7 @@
         <w:t>Ground</w:t>
       </w:r>
       <w:r>
-        <w:t xml:space="preserve"> – use “</w:t>
-      </w:r>
-      <w:proofErr w:type="spellStart"/>
-      <w:r>
-        <w:t>grd_floor</w:t>
-      </w:r>
-      <w:proofErr w:type="spellEnd"/>
-      <w:r>
-        <w:t>”</w:t>
+        <w:t xml:space="preserve"> – use “grd_floor”</w:t>
       </w:r>
     </w:p>
     <w:p>
@@ -1915,15 +1870,7 @@
         <w:t>Outside Boundary Condition</w:t>
       </w:r>
       <w:r>
-        <w:t xml:space="preserve"> - use “</w:t>
-      </w:r>
-      <w:proofErr w:type="spellStart"/>
-      <w:r>
-        <w:t>attic_flr</w:t>
-      </w:r>
-      <w:proofErr w:type="spellEnd"/>
-      <w:r>
-        <w:t>”</w:t>
+        <w:t xml:space="preserve"> - use “attic_flr”</w:t>
       </w:r>
     </w:p>
     <w:p>
@@ -1935,23 +1882,7 @@
         </w:numPr>
       </w:pPr>
       <w:r>
-        <w:t>In the garage, “</w:t>
-      </w:r>
-      <w:proofErr w:type="spellStart"/>
-      <w:r>
-        <w:t>garage_ceiling</w:t>
-      </w:r>
-      <w:proofErr w:type="spellEnd"/>
-      <w:r>
-        <w:t>” - use “</w:t>
-      </w:r>
-      <w:proofErr w:type="spellStart"/>
-      <w:r>
-        <w:t>attic_flr</w:t>
-      </w:r>
-      <w:proofErr w:type="spellEnd"/>
-      <w:r>
-        <w:t>”</w:t>
+        <w:t>In the garage, “garage_ceiling” - use “attic_flr”</w:t>
       </w:r>
     </w:p>
     <w:p/>
@@ -1972,14 +1903,12 @@
       <w:r>
         <w:t xml:space="preserve">The construction of the windows and doors are set in the same manner, in the </w:t>
       </w:r>
-      <w:proofErr w:type="spellStart"/>
       <w:r>
         <w:rPr>
           <w:b/>
         </w:rPr>
         <w:t>Subsurfaces</w:t>
       </w:r>
-      <w:proofErr w:type="spellEnd"/>
       <w:r>
         <w:t xml:space="preserve"> tab, next to the </w:t>
       </w:r>
@@ -3309,6 +3238,7 @@
         <w:rPr>
           <w:rFonts w:eastAsiaTheme="minorEastAsia"/>
         </w:rPr>
+        <w:lastRenderedPageBreak/>
         <w:t>The inputs for the object can be edited by clicking on the object afterwards.</w:t>
       </w:r>
     </w:p>
@@ -3323,7 +3253,6 @@
         <w:rPr>
           <w:rFonts w:eastAsiaTheme="minorEastAsia"/>
         </w:rPr>
-        <w:lastRenderedPageBreak/>
         <w:t>Because the infiltration calculated above is an ACH, the Design Flow Rate</w:t>
       </w:r>
       <w:r>
@@ -3336,35 +3265,7 @@
         <w:rPr>
           <w:rFonts w:eastAsiaTheme="minorEastAsia"/>
         </w:rPr>
-        <w:t xml:space="preserve">Calculation Method needs to be set to </w:t>
-      </w:r>
-      <w:proofErr w:type="spellStart"/>
-      <w:r>
-        <w:rPr>
-          <w:rFonts w:eastAsiaTheme="minorEastAsia"/>
-        </w:rPr>
-        <w:t>AirChanges</w:t>
-      </w:r>
-      <w:proofErr w:type="spellEnd"/>
-      <w:r>
-        <w:rPr>
-          <w:rFonts w:eastAsiaTheme="minorEastAsia"/>
-        </w:rPr>
-        <w:t xml:space="preserve">/Hour and the value entered under the </w:t>
-      </w:r>
-      <w:proofErr w:type="spellStart"/>
-      <w:r>
-        <w:rPr>
-          <w:rFonts w:eastAsiaTheme="minorEastAsia"/>
-        </w:rPr>
-        <w:t>AirChanges</w:t>
-      </w:r>
-      <w:proofErr w:type="spellEnd"/>
-      <w:r>
-        <w:rPr>
-          <w:rFonts w:eastAsiaTheme="minorEastAsia"/>
-        </w:rPr>
-        <w:t>/Hour box.</w:t>
+        <w:t>Calculation Method needs to be set to AirChanges/Hour and the value entered under the AirChanges/Hour box.</w:t>
       </w:r>
       <w:r>
         <w:rPr>
@@ -3839,6 +3740,7 @@
         </w:numPr>
       </w:pPr>
       <w:r>
+        <w:lastRenderedPageBreak/>
         <w:t xml:space="preserve">A single schedule object can contain multiple </w:t>
       </w:r>
       <w:r>
@@ -3862,11 +3764,7 @@
         <w:t xml:space="preserve"> profile runs for everyday of the year</w:t>
       </w:r>
       <w:r>
-        <w:t xml:space="preserve">. More </w:t>
-      </w:r>
-      <w:r>
-        <w:lastRenderedPageBreak/>
-        <w:t xml:space="preserve">profiles can be defined by click on the </w:t>
+        <w:t xml:space="preserve">. More profiles can be defined by click on the </w:t>
       </w:r>
       <w:r>
         <w:rPr>
@@ -4126,7 +4024,6 @@
       <w:r>
         <w:t xml:space="preserve"> requires an </w:t>
       </w:r>
-      <w:proofErr w:type="spellStart"/>
       <w:r>
         <w:rPr>
           <w:b/>
@@ -4134,7 +4031,6 @@
         </w:rPr>
         <w:t>ActivityLevel</w:t>
       </w:r>
-      <w:proofErr w:type="spellEnd"/>
       <w:r>
         <w:t xml:space="preserve"> schedule type. The schedule values are in units of</w:t>
       </w:r>
@@ -4666,15 +4562,7 @@
         </w:numPr>
       </w:pPr>
       <w:r>
-        <w:t>Lastly, drag and drop the always on schedule (create a fractional schedule with a constant 1) next to the “</w:t>
-      </w:r>
-      <w:proofErr w:type="spellStart"/>
-      <w:r>
-        <w:t>ccht_infil</w:t>
-      </w:r>
-      <w:proofErr w:type="spellEnd"/>
-      <w:r>
-        <w:t xml:space="preserve">” objects for each </w:t>
+        <w:t xml:space="preserve">Lastly, drag and drop the always on schedule (create a fractional schedule with a constant 1) next to the “ccht_infil” objects for each </w:t>
       </w:r>
       <w:r>
         <w:t>space</w:t>
@@ -4711,96 +4599,24 @@
         </w:numPr>
       </w:pPr>
       <w:r>
-        <w:t>Set the weather file and design day condition. The .</w:t>
-      </w:r>
-      <w:proofErr w:type="spellStart"/>
-      <w:r>
-        <w:t>ddy</w:t>
-      </w:r>
-      <w:proofErr w:type="spellEnd"/>
-      <w:r>
-        <w:t xml:space="preserve"> contains multiple design day datasets; we will only use </w:t>
+        <w:t xml:space="preserve">Set the weather file and design day condition. The .ddy contains multiple design day datasets; we will only use </w:t>
       </w:r>
       <w:r>
         <w:rPr>
           <w:b/>
           <w:bCs/>
         </w:rPr>
-        <w:t xml:space="preserve">Ottawa Intl AP Ann </w:t>
-      </w:r>
-      <w:proofErr w:type="spellStart"/>
+        <w:t>Ottawa Intl AP Ann Clg .4% Condns DB=&gt;MWB</w:t>
+      </w:r>
+      <w:r>
+        <w:t xml:space="preserve"> and </w:t>
+      </w:r>
       <w:r>
         <w:rPr>
           <w:b/>
           <w:bCs/>
         </w:rPr>
-        <w:t>Clg</w:t>
-      </w:r>
-      <w:proofErr w:type="spellEnd"/>
-      <w:r>
-        <w:rPr>
-          <w:b/>
-          <w:bCs/>
-        </w:rPr>
-        <w:t xml:space="preserve"> .4% </w:t>
-      </w:r>
-      <w:proofErr w:type="spellStart"/>
-      <w:r>
-        <w:rPr>
-          <w:b/>
-          <w:bCs/>
-        </w:rPr>
-        <w:t>Condns</w:t>
-      </w:r>
-      <w:proofErr w:type="spellEnd"/>
-      <w:r>
-        <w:rPr>
-          <w:b/>
-          <w:bCs/>
-        </w:rPr>
-        <w:t xml:space="preserve"> DB=&gt;MWB</w:t>
-      </w:r>
-      <w:r>
-        <w:t xml:space="preserve"> and </w:t>
-      </w:r>
-      <w:r>
-        <w:rPr>
-          <w:b/>
-          <w:bCs/>
-        </w:rPr>
-        <w:t xml:space="preserve">Ottawa Intl AP Ann </w:t>
-      </w:r>
-      <w:proofErr w:type="spellStart"/>
-      <w:r>
-        <w:rPr>
-          <w:b/>
-          <w:bCs/>
-        </w:rPr>
-        <w:t>Htg</w:t>
-      </w:r>
-      <w:proofErr w:type="spellEnd"/>
-      <w:r>
-        <w:rPr>
-          <w:b/>
-          <w:bCs/>
-        </w:rPr>
-        <w:t xml:space="preserve"> 99.6% </w:t>
-      </w:r>
-      <w:proofErr w:type="spellStart"/>
-      <w:r>
-        <w:rPr>
-          <w:b/>
-          <w:bCs/>
-        </w:rPr>
-        <w:t>Condns</w:t>
-      </w:r>
-      <w:proofErr w:type="spellEnd"/>
-      <w:r>
-        <w:rPr>
-          <w:b/>
-          <w:bCs/>
-        </w:rPr>
-        <w:t xml:space="preserve"> DB</w:t>
+        <w:t>Ottawa Intl AP Ann Htg 99.6% Condns DB</w:t>
       </w:r>
       <w:r>
         <w:t xml:space="preserve">. Delete the rest. </w:t>
@@ -5099,65 +4915,33 @@
           <w:b/>
           <w:bCs/>
         </w:rPr>
-        <w:t xml:space="preserve">Space </w:t>
-      </w:r>
-      <w:proofErr w:type="spellStart"/>
+        <w:t xml:space="preserve">Space InfiltrationDesign Flow Rates </w:t>
+      </w:r>
+      <w:r>
+        <w:t xml:space="preserve">object, the </w:t>
+      </w:r>
       <w:r>
         <w:rPr>
           <w:b/>
           <w:bCs/>
         </w:rPr>
-        <w:t>InfiltrationDesign</w:t>
-      </w:r>
-      <w:proofErr w:type="spellEnd"/>
+        <w:t xml:space="preserve">Design Specification Outdoor Air Object </w:t>
+      </w:r>
+      <w:r>
+        <w:t xml:space="preserve">can only be created by dropping and editing an existing object from the </w:t>
+      </w:r>
       <w:r>
         <w:rPr>
           <w:b/>
           <w:bCs/>
         </w:rPr>
-        <w:t xml:space="preserve"> Flow Rates </w:t>
-      </w:r>
-      <w:r>
-        <w:t xml:space="preserve">object, the </w:t>
-      </w:r>
-      <w:r>
-        <w:rPr>
-          <w:b/>
-          <w:bCs/>
-        </w:rPr>
-        <w:t xml:space="preserve">Design Specification Outdoor Air Object </w:t>
-      </w:r>
-      <w:r>
-        <w:t xml:space="preserve">can only be created by dropping and editing an existing object from the </w:t>
-      </w:r>
-      <w:r>
-        <w:rPr>
-          <w:b/>
-          <w:bCs/>
-        </w:rPr>
         <w:t xml:space="preserve">Library </w:t>
       </w:r>
       <w:r>
         <w:t>menu on the right.</w:t>
       </w:r>
       <w:r>
-        <w:t xml:space="preserve"> Create outdoor air requirements for the “</w:t>
-      </w:r>
-      <w:proofErr w:type="spellStart"/>
-      <w:r>
-        <w:t>first_floor</w:t>
-      </w:r>
-      <w:proofErr w:type="spellEnd"/>
-      <w:r>
-        <w:t>” and “</w:t>
-      </w:r>
-      <w:proofErr w:type="spellStart"/>
-      <w:r>
-        <w:t>second_floor</w:t>
-      </w:r>
-      <w:proofErr w:type="spellEnd"/>
-      <w:r>
-        <w:t>”.</w:t>
+        <w:t xml:space="preserve"> Create outdoor air requirements for the “first_floor” and “second_floor”.</w:t>
       </w:r>
     </w:p>
     <w:p>
@@ -5600,7 +5384,6 @@
         </w:rPr>
         <w:t>Diffuser (</w:t>
       </w:r>
-      <w:proofErr w:type="spellStart"/>
       <w:r>
         <w:rPr>
           <w:rFonts w:eastAsiaTheme="minorEastAsia"/>
@@ -5609,7 +5392,6 @@
         </w:rPr>
         <w:t>AirTerminal:SingleDuct:ConstantVolume:NoRheat</w:t>
       </w:r>
-      <w:proofErr w:type="spellEnd"/>
       <w:r>
         <w:rPr>
           <w:rFonts w:eastAsiaTheme="minorEastAsia"/>
@@ -5631,7 +5413,6 @@
         </w:rPr>
         <w:t xml:space="preserve">Clicking the dotted lines highlighted below will open access to the </w:t>
       </w:r>
-      <w:proofErr w:type="spellStart"/>
       <w:r>
         <w:rPr>
           <w:rFonts w:eastAsiaTheme="minorEastAsia"/>
@@ -5640,7 +5421,6 @@
         </w:rPr>
         <w:t>Sizing:System</w:t>
       </w:r>
-      <w:proofErr w:type="spellEnd"/>
       <w:r>
         <w:rPr>
           <w:rFonts w:eastAsiaTheme="minorEastAsia"/>
@@ -5787,35 +5567,7 @@
           <w:rFonts w:eastAsiaTheme="minorEastAsia"/>
         </w:rPr>
         <w:lastRenderedPageBreak/>
-        <w:t>Drag and drop the zones this system will serve (“</w:t>
-      </w:r>
-      <w:proofErr w:type="spellStart"/>
-      <w:r>
-        <w:rPr>
-          <w:rFonts w:eastAsiaTheme="minorEastAsia"/>
-        </w:rPr>
-        <w:t>first_floor</w:t>
-      </w:r>
-      <w:proofErr w:type="spellEnd"/>
-      <w:r>
-        <w:rPr>
-          <w:rFonts w:eastAsiaTheme="minorEastAsia"/>
-        </w:rPr>
-        <w:t>” and “</w:t>
-      </w:r>
-      <w:proofErr w:type="spellStart"/>
-      <w:r>
-        <w:rPr>
-          <w:rFonts w:eastAsiaTheme="minorEastAsia"/>
-        </w:rPr>
-        <w:t>second_floor</w:t>
-      </w:r>
-      <w:proofErr w:type="spellEnd"/>
-      <w:r>
-        <w:rPr>
-          <w:rFonts w:eastAsiaTheme="minorEastAsia"/>
-        </w:rPr>
-        <w:t>”)</w:t>
+        <w:t>Drag and drop the zones this system will serve (“first_floor” and “second_floor”)</w:t>
       </w:r>
       <w:r>
         <w:rPr>
@@ -5910,7 +5662,6 @@
         </w:rPr>
         <w:t xml:space="preserve">Then click on the </w:t>
       </w:r>
-      <w:proofErr w:type="spellStart"/>
       <w:r>
         <w:rPr>
           <w:rFonts w:eastAsiaTheme="minorEastAsia"/>
@@ -5919,7 +5670,6 @@
         </w:rPr>
         <w:t>SetpointManager:SingleZone:Reheat</w:t>
       </w:r>
-      <w:proofErr w:type="spellEnd"/>
       <w:r>
         <w:rPr>
           <w:rFonts w:eastAsiaTheme="minorEastAsia"/>
@@ -6312,16 +6062,8 @@
         <w:rPr>
           <w:rFonts w:eastAsiaTheme="minorEastAsia"/>
         </w:rPr>
-        <w:t xml:space="preserve">Defrost control – set to </w:t>
-      </w:r>
-      <w:proofErr w:type="spellStart"/>
-      <w:r>
-        <w:rPr>
-          <w:rFonts w:eastAsiaTheme="minorEastAsia"/>
-        </w:rPr>
-        <w:t>ExhaustAirRecirculation</w:t>
-      </w:r>
-      <w:proofErr w:type="spellEnd"/>
+        <w:t>Defrost control – set to ExhaustAirRecirculation</w:t>
+      </w:r>
     </w:p>
     <w:p>
       <w:pPr>
@@ -6388,14 +6130,12 @@
           <w:rFonts w:eastAsiaTheme="minorEastAsia"/>
         </w:rPr>
       </w:pPr>
-      <w:proofErr w:type="spellStart"/>
       <w:r>
         <w:rPr>
           <w:rFonts w:eastAsiaTheme="minorEastAsia"/>
         </w:rPr>
         <w:t>Controller:OutdoorAir</w:t>
       </w:r>
-      <w:proofErr w:type="spellEnd"/>
     </w:p>
     <w:p>
       <w:pPr>
@@ -6412,16 +6152,8 @@
         <w:rPr>
           <w:rFonts w:eastAsiaTheme="minorEastAsia"/>
         </w:rPr>
-        <w:t xml:space="preserve">Minimum air flowrate – set to </w:t>
-      </w:r>
-      <w:proofErr w:type="spellStart"/>
-      <w:r>
-        <w:rPr>
-          <w:rFonts w:eastAsiaTheme="minorEastAsia"/>
-        </w:rPr>
-        <w:t>Autosize</w:t>
-      </w:r>
-      <w:proofErr w:type="spellEnd"/>
+        <w:t>Minimum air flowrate – set to Autosize</w:t>
+      </w:r>
     </w:p>
     <w:p>
       <w:pPr>
@@ -6452,14 +6184,12 @@
           <w:rFonts w:eastAsiaTheme="minorEastAsia"/>
         </w:rPr>
       </w:pPr>
-      <w:proofErr w:type="spellStart"/>
       <w:r>
         <w:rPr>
           <w:rFonts w:eastAsiaTheme="minorEastAsia"/>
         </w:rPr>
         <w:t>Coil:Cooling:DX:SingleSpeed</w:t>
       </w:r>
-      <w:proofErr w:type="spellEnd"/>
     </w:p>
     <w:p>
       <w:pPr>
@@ -6526,14 +6256,12 @@
           <w:rFonts w:eastAsiaTheme="minorEastAsia"/>
         </w:rPr>
       </w:pPr>
-      <w:proofErr w:type="spellStart"/>
       <w:r>
         <w:rPr>
           <w:rFonts w:eastAsiaTheme="minorEastAsia"/>
         </w:rPr>
         <w:t>Coil:Heating:Gas</w:t>
       </w:r>
-      <w:proofErr w:type="spellEnd"/>
     </w:p>
     <w:p>
       <w:pPr>
@@ -6568,16 +6296,8 @@
         <w:rPr>
           <w:rFonts w:eastAsiaTheme="minorEastAsia"/>
         </w:rPr>
-        <w:t xml:space="preserve">Set Fuel type to </w:t>
-      </w:r>
-      <w:proofErr w:type="spellStart"/>
-      <w:r>
-        <w:rPr>
-          <w:rFonts w:eastAsiaTheme="minorEastAsia"/>
-        </w:rPr>
-        <w:t>NaturalGas</w:t>
-      </w:r>
-      <w:proofErr w:type="spellEnd"/>
+        <w:t>Set Fuel type to NaturalGas</w:t>
+      </w:r>
     </w:p>
     <w:p>
       <w:pPr>
@@ -6680,6 +6400,7 @@
         <w:rPr>
           <w:rFonts w:eastAsiaTheme="minorEastAsia"/>
         </w:rPr>
+        <w:lastRenderedPageBreak/>
         <w:t xml:space="preserve">Navigate to the Internal Loads </w:t>
       </w:r>
       <w:r>
@@ -6770,7 +6491,6 @@
           <w:rFonts w:eastAsiaTheme="minorEastAsia"/>
           <w:noProof/>
         </w:rPr>
-        <w:lastRenderedPageBreak/>
         <w:drawing>
           <wp:inline distT="0" distB="0" distL="0" distR="0" wp14:anchorId="233E7CFE" wp14:editId="3FED68B2">
             <wp:extent cx="1951753" cy="2683116"/>
@@ -6844,21 +6564,7 @@
         <w:rPr>
           <w:rFonts w:eastAsiaTheme="minorEastAsia"/>
         </w:rPr>
-        <w:t>Manually create hot water load profile as a 5-min-step schedule found in the “DHW” sheet of “building_data.xlsx” OR import the “</w:t>
-      </w:r>
-      <w:proofErr w:type="spellStart"/>
-      <w:r>
-        <w:rPr>
-          <w:rFonts w:eastAsiaTheme="minorEastAsia"/>
-        </w:rPr>
-        <w:t>dhw_load_profile.osm</w:t>
-      </w:r>
-      <w:proofErr w:type="spellEnd"/>
-      <w:r>
-        <w:rPr>
-          <w:rFonts w:eastAsiaTheme="minorEastAsia"/>
-        </w:rPr>
-        <w:t xml:space="preserve">” as a library </w:t>
+        <w:t xml:space="preserve">Manually create hot water load profile as a 5-min-step schedule found in the “DHW” sheet of “building_data.xlsx” OR import the “dhw_load_profile.osm” as a library </w:t>
       </w:r>
       <w:r>
         <w:rPr>
@@ -6953,21 +6659,7 @@
         <w:rPr>
           <w:rFonts w:eastAsiaTheme="minorEastAsia"/>
         </w:rPr>
-        <w:t xml:space="preserve">Afterwards, the </w:t>
-      </w:r>
-      <w:proofErr w:type="spellStart"/>
-      <w:r>
-        <w:rPr>
-          <w:rFonts w:eastAsiaTheme="minorEastAsia"/>
-        </w:rPr>
-        <w:t>dhw_load_profile</w:t>
-      </w:r>
-      <w:proofErr w:type="spellEnd"/>
-      <w:r>
-        <w:rPr>
-          <w:rFonts w:eastAsiaTheme="minorEastAsia"/>
-        </w:rPr>
-        <w:t xml:space="preserve"> schedule should appear under the </w:t>
+        <w:t xml:space="preserve">Afterwards, the dhw_load_profile schedule should appear under the </w:t>
       </w:r>
       <w:r>
         <w:rPr>
@@ -7577,21 +7269,7 @@
         <w:rPr>
           <w:rFonts w:eastAsiaTheme="minorEastAsia"/>
         </w:rPr>
-        <w:t>(“</w:t>
-      </w:r>
-      <w:proofErr w:type="spellStart"/>
-      <w:r>
-        <w:rPr>
-          <w:rFonts w:eastAsiaTheme="minorEastAsia"/>
-        </w:rPr>
-        <w:t>first_floor</w:t>
-      </w:r>
-      <w:proofErr w:type="spellEnd"/>
-      <w:r>
-        <w:rPr>
-          <w:rFonts w:eastAsiaTheme="minorEastAsia"/>
-        </w:rPr>
-        <w:t xml:space="preserve">”) </w:t>
+        <w:t xml:space="preserve">(“first_floor”) </w:t>
       </w:r>
       <w:r>
         <w:rPr>
@@ -7611,21 +7289,7 @@
         <w:rPr>
           <w:rFonts w:eastAsiaTheme="minorEastAsia"/>
         </w:rPr>
-        <w:t xml:space="preserve"> (“</w:t>
-      </w:r>
-      <w:proofErr w:type="spellStart"/>
-      <w:r>
-        <w:rPr>
-          <w:rFonts w:eastAsiaTheme="minorEastAsia"/>
-        </w:rPr>
-        <w:t>dhw_load_profile</w:t>
-      </w:r>
-      <w:proofErr w:type="spellEnd"/>
-      <w:r>
-        <w:rPr>
-          <w:rFonts w:eastAsiaTheme="minorEastAsia"/>
-        </w:rPr>
-        <w:t>”).</w:t>
+        <w:t xml:space="preserve"> (“dhw_load_profile”).</w:t>
       </w:r>
     </w:p>
     <w:p>
@@ -7643,16 +7307,8 @@
         <w:rPr>
           <w:rFonts w:eastAsiaTheme="minorEastAsia"/>
         </w:rPr>
-        <w:t xml:space="preserve">Set the </w:t>
-      </w:r>
-      <w:proofErr w:type="spellStart"/>
-      <w:r>
-        <w:rPr>
-          <w:rFonts w:eastAsiaTheme="minorEastAsia"/>
-        </w:rPr>
-        <w:t>Pump:ConstantSpeed</w:t>
-      </w:r>
-      <w:proofErr w:type="spellEnd"/>
+        <w:t>Set the Pump:ConstantSpeed</w:t>
+      </w:r>
       <w:r>
         <w:rPr>
           <w:rFonts w:eastAsiaTheme="minorEastAsia"/>
@@ -7715,16 +7371,8 @@
         <w:rPr>
           <w:rFonts w:eastAsiaTheme="minorEastAsia"/>
         </w:rPr>
-        <w:t xml:space="preserve"> to </w:t>
-      </w:r>
-      <w:proofErr w:type="spellStart"/>
-      <w:r>
-        <w:rPr>
-          <w:rFonts w:eastAsiaTheme="minorEastAsia"/>
-        </w:rPr>
-        <w:t>autosize</w:t>
-      </w:r>
-      <w:proofErr w:type="spellEnd"/>
+        <w:t xml:space="preserve"> to autosize</w:t>
+      </w:r>
     </w:p>
     <w:p>
       <w:pPr>
@@ -7776,7 +7424,6 @@
           <w:rFonts w:eastAsiaTheme="minorEastAsia"/>
         </w:rPr>
       </w:pPr>
-      <w:proofErr w:type="spellStart"/>
       <w:r>
         <w:rPr>
           <w:rFonts w:eastAsiaTheme="minorEastAsia"/>
@@ -7785,7 +7432,6 @@
         </w:rPr>
         <w:t>Deadband</w:t>
       </w:r>
-      <w:proofErr w:type="spellEnd"/>
       <w:r>
         <w:rPr>
           <w:rFonts w:eastAsiaTheme="minorEastAsia"/>
@@ -8100,16 +7746,8 @@
         <w:rPr>
           <w:rFonts w:eastAsiaTheme="minorEastAsia"/>
         </w:rPr>
-        <w:t xml:space="preserve"> to </w:t>
-      </w:r>
-      <w:proofErr w:type="spellStart"/>
-      <w:r>
-        <w:rPr>
-          <w:rFonts w:eastAsiaTheme="minorEastAsia"/>
-        </w:rPr>
-        <w:t>ThermalZone</w:t>
-      </w:r>
-      <w:proofErr w:type="spellEnd"/>
+        <w:t xml:space="preserve"> to ThermalZone</w:t>
+      </w:r>
     </w:p>
     <w:p>
       <w:pPr>
@@ -8134,14 +7772,7 @@
         <w:rPr>
           <w:rFonts w:eastAsiaTheme="minorEastAsia"/>
         </w:rPr>
-        <w:t xml:space="preserve"> to </w:t>
-      </w:r>
-      <w:proofErr w:type="spellStart"/>
-      <w:r>
-        <w:rPr>
-          <w:rFonts w:eastAsiaTheme="minorEastAsia"/>
-        </w:rPr>
-        <w:t>first_</w:t>
+        <w:t xml:space="preserve"> to first_</w:t>
       </w:r>
       <w:r>
         <w:rPr>
@@ -8149,7 +7780,6 @@
         </w:rPr>
         <w:t>floor</w:t>
       </w:r>
-      <w:proofErr w:type="spellEnd"/>
     </w:p>
     <w:p>
       <w:pPr>
@@ -8380,14 +8010,12 @@
         </w:rPr>
         <w:t xml:space="preserve">scroll down to find the </w:t>
       </w:r>
-      <w:proofErr w:type="spellStart"/>
       <w:r>
         <w:rPr>
           <w:rFonts w:eastAsiaTheme="minorEastAsia"/>
         </w:rPr>
         <w:t>OS:Waterheater:sizing</w:t>
       </w:r>
-      <w:proofErr w:type="spellEnd"/>
       <w:r>
         <w:rPr>
           <w:rFonts w:eastAsiaTheme="minorEastAsia"/>
@@ -8516,15 +8144,7 @@
         </w:numPr>
       </w:pPr>
       <w:r>
-        <w:t xml:space="preserve">Heating Coil </w:t>
-      </w:r>
-      <w:proofErr w:type="spellStart"/>
-      <w:r>
-        <w:t>NaturalGas</w:t>
-      </w:r>
-      <w:proofErr w:type="spellEnd"/>
-      <w:r>
-        <w:t xml:space="preserve"> Energy (J) – input energy for the duration of the reporting period</w:t>
+        <w:t>Heating Coil NaturalGas Energy (J) – input energy for the duration of the reporting period</w:t>
       </w:r>
       <w:r>
         <w:t xml:space="preserve"> (reports output for all heating coil that uses gas objects kin the model)</w:t>
@@ -8710,15 +8330,7 @@
         </w:numPr>
       </w:pPr>
       <w:r>
-        <w:t xml:space="preserve">Comfort and Setpoint </w:t>
-      </w:r>
-      <w:proofErr w:type="spellStart"/>
-      <w:r>
-        <w:t>Setpoint</w:t>
-      </w:r>
-      <w:proofErr w:type="spellEnd"/>
-      <w:r>
-        <w:t xml:space="preserve"> Not Met Summary – number of unmet heating and cooling hours</w:t>
+        <w:t>Comfort and Setpoint Setpoint Not Met Summary – number of unmet heating and cooling hours</w:t>
       </w:r>
     </w:p>
     <w:p>
@@ -8730,6 +8342,7 @@
         </w:numPr>
       </w:pPr>
       <w:r>
+        <w:lastRenderedPageBreak/>
         <w:t>Other reports can be accessed by clicking on the Table of Contents link:</w:t>
       </w:r>
     </w:p>
@@ -8742,7 +8355,6 @@
         </w:numPr>
       </w:pPr>
       <w:r>
-        <w:lastRenderedPageBreak/>
         <w:t>Component Sizing Summary – Sizing information for individual components</w:t>
       </w:r>
     </w:p>
@@ -8760,15 +8372,7 @@
     </w:p>
     <w:p>
       <w:r>
-        <w:t xml:space="preserve">Individual outputs can be view by using </w:t>
-      </w:r>
-      <w:proofErr w:type="spellStart"/>
-      <w:r>
-        <w:t>DView</w:t>
-      </w:r>
-      <w:proofErr w:type="spellEnd"/>
-      <w:r>
-        <w:t xml:space="preserve">. </w:t>
+        <w:t xml:space="preserve">Individual outputs can be view by using DView. </w:t>
       </w:r>
     </w:p>
     <w:p>
@@ -8829,15 +8433,7 @@
     <w:p/>
     <w:p>
       <w:r>
-        <w:t xml:space="preserve">You may need to set up </w:t>
-      </w:r>
-      <w:proofErr w:type="spellStart"/>
-      <w:r>
-        <w:t>DView</w:t>
-      </w:r>
-      <w:proofErr w:type="spellEnd"/>
-      <w:r>
-        <w:t xml:space="preserve"> first by linking OpenStudio to the .exe file</w:t>
+        <w:t>You may need to set up DView first by linking OpenStudio to the .exe file</w:t>
       </w:r>
     </w:p>
     <w:p>
@@ -9005,15 +8601,7 @@
         <w:t>o</w:t>
       </w:r>
       <w:r>
-        <w:t>C) – not accessible through the OpenStudio Application (edit the EnergyPlus .</w:t>
-      </w:r>
-      <w:proofErr w:type="spellStart"/>
-      <w:r>
-        <w:t>idf</w:t>
-      </w:r>
-      <w:proofErr w:type="spellEnd"/>
-      <w:r>
-        <w:t xml:space="preserve"> file)</w:t>
+        <w:t>C) – not accessible through the OpenStudio Application (edit the EnergyPlus .idf file)</w:t>
       </w:r>
     </w:p>
     <w:p>
@@ -9062,6 +8650,7 @@
         </w:numPr>
       </w:pPr>
       <w:r>
+        <w:lastRenderedPageBreak/>
         <w:t>Validating/Calibrating</w:t>
       </w:r>
     </w:p>
@@ -9079,7 +8668,6 @@
         </w:numPr>
       </w:pPr>
       <w:r>
-        <w:lastRenderedPageBreak/>
         <w:t>Check the number of unmet hours</w:t>
       </w:r>
     </w:p>

</xml_diff>